<commit_message>
agrege la base de datos
</commit_message>
<xml_diff>
--- a/docs/documents/1-Formato-Propuesta_TDG.docx
+++ b/docs/documents/1-Formato-Propuesta_TDG.docx
@@ -183,6 +183,7 @@
                                   <w:alias w:val="Autor"/>
                                   <w:tag w:val=""/>
                                   <w:id w:val="-954487662"/>
+                                  <w:showingPlcHdr/>
                                   <w:dataBinding w:prefixMappings="xmlns:ns0='http://purl.org/dc/elements/1.1/' xmlns:ns1='http://schemas.openxmlformats.org/package/2006/metadata/core-properties' " w:xpath="/ns1:coreProperties[1]/ns0:creator[1]" w:storeItemID="{6C3C8BC8-F283-45AE-878A-BAB7291924A1}"/>
                                   <w:text/>
                                 </w:sdtPr>
@@ -205,27 +206,7 @@
                                         <w:sz w:val="24"/>
                                         <w:szCs w:val="24"/>
                                       </w:rPr>
-                                      <w:t xml:space="preserve">Jaramillo </w:t>
-                                    </w:r>
-                                    <w:proofErr w:type="gramStart"/>
-                                    <w:r>
-                                      <w:rPr>
-                                        <w:caps/>
-                                        <w:color w:val="C00000"/>
-                                        <w:sz w:val="24"/>
-                                        <w:szCs w:val="24"/>
-                                      </w:rPr>
-                                      <w:t>Ramirez,Fredy</w:t>
-                                    </w:r>
-                                    <w:proofErr w:type="gramEnd"/>
-                                    <w:r>
-                                      <w:rPr>
-                                        <w:caps/>
-                                        <w:color w:val="C00000"/>
-                                        <w:sz w:val="24"/>
-                                        <w:szCs w:val="24"/>
-                                      </w:rPr>
-                                      <w:t xml:space="preserve"> Esteban</w:t>
+                                      <w:t xml:space="preserve">     </w:t>
                                     </w:r>
                                   </w:p>
                                 </w:sdtContent>
@@ -352,6 +333,7 @@
                             <w:alias w:val="Autor"/>
                             <w:tag w:val=""/>
                             <w:id w:val="-954487662"/>
+                            <w:showingPlcHdr/>
                             <w:dataBinding w:prefixMappings="xmlns:ns0='http://purl.org/dc/elements/1.1/' xmlns:ns1='http://schemas.openxmlformats.org/package/2006/metadata/core-properties' " w:xpath="/ns1:coreProperties[1]/ns0:creator[1]" w:storeItemID="{6C3C8BC8-F283-45AE-878A-BAB7291924A1}"/>
                             <w:text/>
                           </w:sdtPr>
@@ -374,27 +356,7 @@
                                   <w:sz w:val="24"/>
                                   <w:szCs w:val="24"/>
                                 </w:rPr>
-                                <w:t xml:space="preserve">Jaramillo </w:t>
-                              </w:r>
-                              <w:proofErr w:type="gramStart"/>
-                              <w:r>
-                                <w:rPr>
-                                  <w:caps/>
-                                  <w:color w:val="C00000"/>
-                                  <w:sz w:val="24"/>
-                                  <w:szCs w:val="24"/>
-                                </w:rPr>
-                                <w:t>Ramirez,Fredy</w:t>
-                              </w:r>
-                              <w:proofErr w:type="gramEnd"/>
-                              <w:r>
-                                <w:rPr>
-                                  <w:caps/>
-                                  <w:color w:val="C00000"/>
-                                  <w:sz w:val="24"/>
-                                  <w:szCs w:val="24"/>
-                                </w:rPr>
-                                <w:t xml:space="preserve"> Esteban</w:t>
+                                <w:t xml:space="preserve">     </w:t>
                               </w:r>
                             </w:p>
                           </w:sdtContent>
@@ -3284,10 +3246,7 @@
                               <w:jc w:val="center"/>
                             </w:pPr>
                             <w:r>
-                              <w:t>Imagen de apoyo #</w:t>
-                            </w:r>
-                            <w:r>
-                              <w:t>2</w:t>
+                              <w:t>Imagen de apoyo #2</w:t>
                             </w:r>
                           </w:p>
                         </w:txbxContent>
@@ -7062,175 +7021,10 @@
 <b:Sources xmlns:b="http://schemas.openxmlformats.org/officeDocument/2006/bibliography" xmlns="http://schemas.openxmlformats.org/officeDocument/2006/bibliography" SelectedStyle="\APASixthEditionOfficeOnline.xsl" StyleName="APA" Version="6"/>
 </file>
 
-<file path=customXml/item2.xml><?xml version="1.0" encoding="utf-8"?>
-<ct:contentTypeSchema xmlns:ct="http://schemas.microsoft.com/office/2006/metadata/contentType" xmlns:ma="http://schemas.microsoft.com/office/2006/metadata/properties/metaAttributes" ct:_="" ma:_="" ma:contentTypeName="Document" ma:contentTypeID="0x010100B9632579858BA542BACEDD9CBDF8E988" ma:contentTypeVersion="3" ma:contentTypeDescription="Create a new document." ma:contentTypeScope="" ma:versionID="669813516e77df02b2535f7965ccdd37">
-  <xsd:schema xmlns:xsd="http://www.w3.org/2001/XMLSchema" xmlns:xs="http://www.w3.org/2001/XMLSchema" xmlns:p="http://schemas.microsoft.com/office/2006/metadata/properties" xmlns:ns2="06b412d0-96db-441b-af07-43f3058a0735" targetNamespace="http://schemas.microsoft.com/office/2006/metadata/properties" ma:root="true" ma:fieldsID="9c503bdc05eafa77d55a520f7af95c15" ns2:_="">
-    <xsd:import namespace="06b412d0-96db-441b-af07-43f3058a0735"/>
-    <xsd:element name="properties">
-      <xsd:complexType>
-        <xsd:sequence>
-          <xsd:element name="documentManagement">
-            <xsd:complexType>
-              <xsd:all>
-                <xsd:element ref="ns2:MediaServiceMetadata" minOccurs="0"/>
-                <xsd:element ref="ns2:MediaServiceFastMetadata" minOccurs="0"/>
-                <xsd:element ref="ns2:MediaServiceSearchProperties" minOccurs="0"/>
-              </xsd:all>
-            </xsd:complexType>
-          </xsd:element>
-        </xsd:sequence>
-      </xsd:complexType>
-    </xsd:element>
-  </xsd:schema>
-  <xsd:schema xmlns:xsd="http://www.w3.org/2001/XMLSchema" xmlns:xs="http://www.w3.org/2001/XMLSchema" xmlns:dms="http://schemas.microsoft.com/office/2006/documentManagement/types" xmlns:pc="http://schemas.microsoft.com/office/infopath/2007/PartnerControls" targetNamespace="06b412d0-96db-441b-af07-43f3058a0735" elementFormDefault="qualified">
-    <xsd:import namespace="http://schemas.microsoft.com/office/2006/documentManagement/types"/>
-    <xsd:import namespace="http://schemas.microsoft.com/office/infopath/2007/PartnerControls"/>
-    <xsd:element name="MediaServiceMetadata" ma:index="8" nillable="true" ma:displayName="MediaServiceMetadata" ma:hidden="true" ma:internalName="MediaServiceMetadata" ma:readOnly="true">
-      <xsd:simpleType>
-        <xsd:restriction base="dms:Note"/>
-      </xsd:simpleType>
-    </xsd:element>
-    <xsd:element name="MediaServiceFastMetadata" ma:index="9" nillable="true" ma:displayName="MediaServiceFastMetadata" ma:hidden="true" ma:internalName="MediaServiceFastMetadata" ma:readOnly="true">
-      <xsd:simpleType>
-        <xsd:restriction base="dms:Note"/>
-      </xsd:simpleType>
-    </xsd:element>
-    <xsd:element name="MediaServiceSearchProperties" ma:index="10" nillable="true" ma:displayName="MediaServiceSearchProperties" ma:hidden="true" ma:internalName="MediaServiceSearchProperties" ma:readOnly="true">
-      <xsd:simpleType>
-        <xsd:restriction base="dms:Note"/>
-      </xsd:simpleType>
-    </xsd:element>
-  </xsd:schema>
-  <xsd:schema xmlns="http://schemas.openxmlformats.org/package/2006/metadata/core-properties" xmlns:xsd="http://www.w3.org/2001/XMLSchema" xmlns:xsi="http://www.w3.org/2001/XMLSchema-instance" xmlns:dc="http://purl.org/dc/elements/1.1/" xmlns:dcterms="http://purl.org/dc/terms/" xmlns:odoc="http://schemas.microsoft.com/internal/obd" targetNamespace="http://schemas.openxmlformats.org/package/2006/metadata/core-properties" elementFormDefault="qualified" attributeFormDefault="unqualified" blockDefault="#all">
-    <xsd:import namespace="http://purl.org/dc/elements/1.1/" schemaLocation="http://dublincore.org/schemas/xmls/qdc/2003/04/02/dc.xsd"/>
-    <xsd:import namespace="http://purl.org/dc/terms/" schemaLocation="http://dublincore.org/schemas/xmls/qdc/2003/04/02/dcterms.xsd"/>
-    <xsd:element name="coreProperties" type="CT_coreProperties"/>
-    <xsd:complexType name="CT_coreProperties">
-      <xsd:all>
-        <xsd:element ref="dc:creator" minOccurs="0" maxOccurs="1"/>
-        <xsd:element ref="dcterms:created" minOccurs="0" maxOccurs="1"/>
-        <xsd:element ref="dc:identifier" minOccurs="0" maxOccurs="1"/>
-        <xsd:element name="contentType" minOccurs="0" maxOccurs="1" type="xsd:string" ma:index="0" ma:displayName="Content Type"/>
-        <xsd:element ref="dc:title" minOccurs="0" maxOccurs="1" ma:index="4" ma:displayName="Title"/>
-        <xsd:element ref="dc:subject" minOccurs="0" maxOccurs="1"/>
-        <xsd:element ref="dc:description" minOccurs="0" maxOccurs="1"/>
-        <xsd:element name="keywords" minOccurs="0" maxOccurs="1" type="xsd:string"/>
-        <xsd:element ref="dc:language" minOccurs="0" maxOccurs="1"/>
-        <xsd:element name="category" minOccurs="0" maxOccurs="1" type="xsd:string"/>
-        <xsd:element name="version" minOccurs="0" maxOccurs="1" type="xsd:string"/>
-        <xsd:element name="revision" minOccurs="0" maxOccurs="1" type="xsd:string">
-          <xsd:annotation>
-            <xsd:documentation>
-                        This value indicates the number of saves or revisions. The application is responsible for updating this value after each revision.
-                    </xsd:documentation>
-          </xsd:annotation>
-        </xsd:element>
-        <xsd:element name="lastModifiedBy" minOccurs="0" maxOccurs="1" type="xsd:string"/>
-        <xsd:element ref="dcterms:modified" minOccurs="0" maxOccurs="1"/>
-        <xsd:element name="contentStatus" minOccurs="0" maxOccurs="1" type="xsd:string"/>
-      </xsd:all>
-    </xsd:complexType>
-  </xsd:schema>
-  <xs:schema xmlns:pc="http://schemas.microsoft.com/office/infopath/2007/PartnerControls" xmlns:xs="http://www.w3.org/2001/XMLSchema" targetNamespace="http://schemas.microsoft.com/office/infopath/2007/PartnerControls" elementFormDefault="qualified" attributeFormDefault="unqualified">
-    <xs:element name="Person">
-      <xs:complexType>
-        <xs:sequence>
-          <xs:element ref="pc:DisplayName" minOccurs="0"/>
-          <xs:element ref="pc:AccountId" minOccurs="0"/>
-          <xs:element ref="pc:AccountType" minOccurs="0"/>
-        </xs:sequence>
-      </xs:complexType>
-    </xs:element>
-    <xs:element name="DisplayName" type="xs:string"/>
-    <xs:element name="AccountId" type="xs:string"/>
-    <xs:element name="AccountType" type="xs:string"/>
-    <xs:element name="BDCAssociatedEntity">
-      <xs:complexType>
-        <xs:sequence>
-          <xs:element ref="pc:BDCEntity" minOccurs="0" maxOccurs="unbounded"/>
-        </xs:sequence>
-        <xs:attribute ref="pc:EntityNamespace"/>
-        <xs:attribute ref="pc:EntityName"/>
-        <xs:attribute ref="pc:SystemInstanceName"/>
-        <xs:attribute ref="pc:AssociationName"/>
-      </xs:complexType>
-    </xs:element>
-    <xs:attribute name="EntityNamespace" type="xs:string"/>
-    <xs:attribute name="EntityName" type="xs:string"/>
-    <xs:attribute name="SystemInstanceName" type="xs:string"/>
-    <xs:attribute name="AssociationName" type="xs:string"/>
-    <xs:element name="BDCEntity">
-      <xs:complexType>
-        <xs:sequence>
-          <xs:element ref="pc:EntityDisplayName" minOccurs="0"/>
-          <xs:element ref="pc:EntityInstanceReference" minOccurs="0"/>
-          <xs:element ref="pc:EntityId1" minOccurs="0"/>
-          <xs:element ref="pc:EntityId2" minOccurs="0"/>
-          <xs:element ref="pc:EntityId3" minOccurs="0"/>
-          <xs:element ref="pc:EntityId4" minOccurs="0"/>
-          <xs:element ref="pc:EntityId5" minOccurs="0"/>
-        </xs:sequence>
-      </xs:complexType>
-    </xs:element>
-    <xs:element name="EntityDisplayName" type="xs:string"/>
-    <xs:element name="EntityInstanceReference" type="xs:string"/>
-    <xs:element name="EntityId1" type="xs:string"/>
-    <xs:element name="EntityId2" type="xs:string"/>
-    <xs:element name="EntityId3" type="xs:string"/>
-    <xs:element name="EntityId4" type="xs:string"/>
-    <xs:element name="EntityId5" type="xs:string"/>
-    <xs:element name="Terms">
-      <xs:complexType>
-        <xs:sequence>
-          <xs:element ref="pc:TermInfo" minOccurs="0" maxOccurs="unbounded"/>
-        </xs:sequence>
-      </xs:complexType>
-    </xs:element>
-    <xs:element name="TermInfo">
-      <xs:complexType>
-        <xs:sequence>
-          <xs:element ref="pc:TermName" minOccurs="0"/>
-          <xs:element ref="pc:TermId" minOccurs="0"/>
-        </xs:sequence>
-      </xs:complexType>
-    </xs:element>
-    <xs:element name="TermName" type="xs:string"/>
-    <xs:element name="TermId" type="xs:string"/>
-  </xs:schema>
-</ct:contentTypeSchema>
-</file>
-
-<file path=customXml/item3.xml><?xml version="1.0" encoding="utf-8"?>
-<?mso-contentType ?>
-<FormTemplates xmlns="http://schemas.microsoft.com/sharepoint/v3/contenttype/forms">
-  <Display>DocumentLibraryForm</Display>
-  <Edit>DocumentLibraryForm</Edit>
-  <New>DocumentLibraryForm</New>
-</FormTemplates>
-</file>
-
-<file path=customXml/item4.xml><?xml version="1.0" encoding="utf-8"?>
-<p:properties xmlns:p="http://schemas.microsoft.com/office/2006/metadata/properties" xmlns:xsi="http://www.w3.org/2001/XMLSchema-instance" xmlns:pc="http://schemas.microsoft.com/office/infopath/2007/PartnerControls">
-  <documentManagement/>
-</p:properties>
-</file>
-
 <file path=customXml/itemProps1.xml><?xml version="1.0" encoding="utf-8"?>
 <ds:datastoreItem xmlns:ds="http://schemas.openxmlformats.org/officeDocument/2006/customXml" ds:itemID="{0C457497-85FA-444D-94D7-57159D245C52}">
   <ds:schemaRefs>
     <ds:schemaRef ds:uri="http://schemas.openxmlformats.org/officeDocument/2006/bibliography"/>
   </ds:schemaRefs>
 </ds:datastoreItem>
-</file>
-
-<file path=customXml/itemProps2.xml><?xml version="1.0" encoding="utf-8"?>
-<ds:datastoreItem xmlns:ds="http://schemas.openxmlformats.org/officeDocument/2006/customXml" ds:itemID="{579ECA6D-82F0-4D58-B0E0-0D716DA82063}"/>
-</file>
-
-<file path=customXml/itemProps3.xml><?xml version="1.0" encoding="utf-8"?>
-<ds:datastoreItem xmlns:ds="http://schemas.openxmlformats.org/officeDocument/2006/customXml" ds:itemID="{318FEC4C-A265-41A4-A674-2938722C4504}"/>
-</file>
-
-<file path=customXml/itemProps4.xml><?xml version="1.0" encoding="utf-8"?>
-<ds:datastoreItem xmlns:ds="http://schemas.openxmlformats.org/officeDocument/2006/customXml" ds:itemID="{6F5618C2-22BD-4DDE-AC35-C5A226AC2ADF}"/>
 </file>
</xml_diff>